<commit_message>
docs: update thuyết minh với hình ảnh sơ đồ và số liệu accuracy 88.98%
</commit_message>
<xml_diff>
--- a/T1S_KMML_Thuyet_minh_Innovator.docx
+++ b/T1S_KMML_Thuyet_minh_Innovator.docx
@@ -29,9 +29,9 @@
         </w:rPr>
         <w:t>Cuộc thi: Vietnamese Student HackAIthon 2026</w:t>
         <w:br/>
-        <w:t>Đội thi: Bảng C - Innovator</w:t>
+        <w:t>Đội thi: T1S_KMML (Bảng C - Innovator)</w:t>
         <w:br/>
-        <w:t>Tác giả: Thí sinh tham gia dự thi</w:t>
+        <w:t>Tác giả: Thành viên đội thi T1S_KMML</w:t>
       </w:r>
     </w:p>
     <w:p>
@@ -62,7 +62,7 @@
         <w:rPr>
           <w:i/>
         </w:rPr>
-        <w:t>Báo cáo này thuyết minh giải pháp tối ưu hóa toàn diện cho mô hình ngôn ngữ lớn Qwen3.5-4B-AWQ-4bit nhằm xử lý hiệu quả bài toán trắc nghiệm đa ngành trong khuôn khổ Bảng C - Innovator. Giải pháp được thiết kế vận hành hoàn toàn offline trong môi trường ảo hóa Docker Container. Để khắc phục triệt để các hạn chế về suy luận logic (như lỗi truncation, lặp prompt, và nhận diện nhầm ký tự), thí sinh đã tích hợp cơ chế Chain-of-Thought tối ưu hóa chiều dài, thuật toán Trích xuất đáp án trực tiếp (Direct Extraction), regex phân biệt chữ hoa/thường cùng hệ thống Tự đồng thuận (Self-Consistency). Về mặt hệ thống, kỹ thuật Dynamic Pipelining trên vLLM LLMEngine cấp thấp đã được phát triển để tối đa hóa 100% công suất GPU. Kết quả thực nghiệm trên 463 câu hỏi Public Test đạt độ chính xác 87.69% với tốc độ xử lý vượt trội đạt 1.49 giây/câu hỏi.</w:t>
+        <w:t>Báo cáo này thuyết minh giải pháp tối ưu hóa toàn diện cho mô hình ngôn ngữ lớn Qwen3.5-4B-AWQ-4bit nhằm xử lý hiệu quả bài toán trắc nghiệm đa ngành trong khuôn khổ Bảng C - Innovator. Giải pháp được thiết kế vận hành hoàn toàn offline trong môi trường ảo hóa Docker Container. Để khắc phục triệt để các hạn chế về suy luận logic (như lỗi truncation, lặp prompt, và nhận diện nhầm ký tự), đội thi đã tích hợp cơ chế Chain-of-Thought tối ưu hóa chiều dài, thuật toán Trích xuất đáp án trực tiếp (Direct Extraction), regex phân biệt chữ hoa/thường cùng hệ thống Tự đồng thuận (Self-Consistency). Về mặt hệ thống, kỹ thuật Dynamic Pipelining trên vLLM LLMEngine cấp thấp đã được phát triển để tối đa hóa 100% công suất GPU. Kết quả thực nghiệm trên 463 câu hỏi Public Test đạt độ chính xác 88.98% với tốc độ xử lý vượt trội đạt 1.49 giây/câu hỏi.</w:t>
       </w:r>
     </w:p>
     <w:p>
@@ -89,7 +89,7 @@
     </w:p>
     <w:p>
       <w:r>
-        <w:t xml:space="preserve">Thí sinh đã lựa chọn mô hình nền tảng </w:t>
+        <w:t xml:space="preserve">Đội thi đã lựa chọn mô hình nền tảng </w:t>
       </w:r>
       <w:r>
         <w:rPr>
@@ -99,6 +99,62 @@
       </w:r>
       <w:r>
         <w:t xml:space="preserve"> để làm lõi xử lý. Mô hình đã được lượng tử hóa (quantized) giúp tiết kiệm đáng kể tài nguyên bộ nhớ đệm KV Cache và VRAM, cho phép vận hành với batch size lớn, đồng thời giữ vững năng lực lập luận ngữ cảnh xuất sắc từ kiến trúc gốc Qwen3.5. Để điều khiển mô hình ngoại tuyến, hệ thống giao tiếp trực tiếp với LLMEngine của thư viện vLLM.</w:t>
+      </w:r>
+    </w:p>
+    <w:p>
+      <w:pPr>
+        <w:spacing w:before="160" w:after="80"/>
+        <w:jc w:val="center"/>
+      </w:pPr>
+    </w:p>
+    <w:p>
+      <w:r>
+        <w:drawing>
+          <wp:inline xmlns:a="http://schemas.openxmlformats.org/drawingml/2006/main" xmlns:pic="http://schemas.openxmlformats.org/drawingml/2006/picture">
+            <wp:extent cx="5303520" cy="3093720"/>
+            <wp:docPr id="1" name="Picture 1"/>
+            <wp:cNvGraphicFramePr>
+              <a:graphicFrameLocks noChangeAspect="1"/>
+            </wp:cNvGraphicFramePr>
+            <a:graphic>
+              <a:graphicData uri="http://schemas.openxmlformats.org/drawingml/2006/picture">
+                <pic:pic>
+                  <pic:nvPicPr>
+                    <pic:cNvPr id="0" name="architecture_flowchart.png"/>
+                    <pic:cNvPicPr/>
+                  </pic:nvPicPr>
+                  <pic:blipFill>
+                    <a:blip r:embed="rId9"/>
+                    <a:stretch>
+                      <a:fillRect/>
+                    </a:stretch>
+                  </pic:blipFill>
+                  <pic:spPr>
+                    <a:xfrm>
+                      <a:off x="0" y="0"/>
+                      <a:ext cx="5303520" cy="3093720"/>
+                    </a:xfrm>
+                    <a:prstGeom prst="rect"/>
+                  </pic:spPr>
+                </pic:pic>
+              </a:graphicData>
+            </a:graphic>
+          </wp:inline>
+        </w:drawing>
+      </w:r>
+    </w:p>
+    <w:p>
+      <w:pPr>
+        <w:spacing w:after="280"/>
+        <w:jc w:val="center"/>
+      </w:pPr>
+      <w:r>
+        <w:rPr>
+          <w:i/>
+          <w:color w:val="5D6D7E"/>
+          <w:sz w:val="19"/>
+        </w:rPr>
+        <w:t>Hình 1: Sơ đồ kiến trúc xử lý song song và luồng suy luận của AI Agent đội thi T1S_KMML</w:t>
       </w:r>
     </w:p>
     <w:p>
@@ -335,7 +391,7 @@
     </w:p>
     <w:p>
       <w:r>
-        <w:t>Giải pháp được đánh giá thực nghiệm trực tiếp trên toàn bộ tập dữ liệu kiểm thử công khai (Public Test) gồm 463 câu hỏi. Thí sinh áp dụng cơ chế tự đồng thuận biểu quyết (Self-Consistency) với tham số cụ thể sau:</w:t>
+        <w:t>Giải pháp được đánh giá thực nghiệm trực tiếp trên toàn bộ tập dữ liệu kiểm thử công khai (Public Test) gồm 463 câu hỏi. Đội thi T1S_KMML áp dụng cơ chế tự đồng thuận biểu quyết (Self-Consistency) với tham số cụ thể sau:</w:t>
       </w:r>
     </w:p>
     <w:p>
@@ -372,10 +428,10 @@
         <w:rPr>
           <w:b/>
         </w:rPr>
-        <w:t>87.69%</w:t>
+        <w:t>88.98%</w:t>
       </w:r>
       <w:r>
-        <w:t xml:space="preserve"> (đúng 406 / 463 câu hỏi). Dưới đây là bảng phân tích chi tiết độ chính xác (Accuracy breakdown) của giải pháp đề xuất trên các phân khúc câu hỏi của tập dữ liệu kiểm thử:</w:t>
+        <w:t xml:space="preserve"> (đúng 412 / 463 câu hỏi). Dưới đây là bảng phân tích chi tiết độ chính xác (Accuracy breakdown) của giải pháp đề xuất trên các phân khúc câu hỏi của tập dữ liệu kiểm thử:</w:t>
       </w:r>
     </w:p>
     <w:tbl>
@@ -509,7 +565,7 @@
               <w:jc w:val="center"/>
             </w:pPr>
             <w:r>
-              <w:t>178 / 200</w:t>
+              <w:t>180 / 200</w:t>
             </w:r>
           </w:p>
         </w:tc>
@@ -535,7 +591,7 @@
               <w:jc w:val="center"/>
             </w:pPr>
             <w:r>
-              <w:t>89.00%</w:t>
+              <w:t>90.00%</w:t>
             </w:r>
           </w:p>
         </w:tc>
@@ -588,7 +644,7 @@
               <w:jc w:val="center"/>
             </w:pPr>
             <w:r>
-              <w:t>228 / 263</w:t>
+              <w:t>232 / 263</w:t>
             </w:r>
           </w:p>
         </w:tc>
@@ -615,7 +671,7 @@
               <w:jc w:val="center"/>
             </w:pPr>
             <w:r>
-              <w:t>86.69%</w:t>
+              <w:t>88.21%</w:t>
             </w:r>
           </w:p>
         </w:tc>
@@ -674,7 +730,7 @@
               <w:rPr>
                 <w:b/>
               </w:rPr>
-              <w:t>406 / 463</w:t>
+              <w:t>412 / 463</w:t>
             </w:r>
           </w:p>
         </w:tc>
@@ -705,7 +761,7 @@
                 <w:b/>
                 <w:color w:val="1A5276"/>
               </w:rPr>
-              <w:t>87.69%</w:t>
+              <w:t>88.98%</w:t>
             </w:r>
           </w:p>
         </w:tc>
@@ -732,7 +788,7 @@
         <w:rPr>
           <w:b/>
         </w:rPr>
-        <w:t>691.96 giây</w:t>
+        <w:t>688.58 giây</w:t>
       </w:r>
       <w:r>
         <w:t xml:space="preserve"> (~11.5 phút). Thời gian xử lý trung bình đạt </w:t>

</xml_diff>

<commit_message>
docs: update simplified clean flowchart in Thuyết minh
</commit_message>
<xml_diff>
--- a/T1S_KMML_Thuyet_minh_Innovator.docx
+++ b/T1S_KMML_Thuyet_minh_Innovator.docx
@@ -111,7 +111,7 @@
       <w:r>
         <w:drawing>
           <wp:inline xmlns:a="http://schemas.openxmlformats.org/drawingml/2006/main" xmlns:pic="http://schemas.openxmlformats.org/drawingml/2006/picture">
-            <wp:extent cx="5303520" cy="3093720"/>
+            <wp:extent cx="5303520" cy="2651760"/>
             <wp:docPr id="1" name="Picture 1"/>
             <wp:cNvGraphicFramePr>
               <a:graphicFrameLocks noChangeAspect="1"/>
@@ -132,7 +132,7 @@
                   <pic:spPr>
                     <a:xfrm>
                       <a:off x="0" y="0"/>
-                      <a:ext cx="5303520" cy="3093720"/>
+                      <a:ext cx="5303520" cy="2651760"/>
                     </a:xfrm>
                     <a:prstGeom prst="rect"/>
                   </pic:spPr>

</xml_diff>

<commit_message>
docs: update vertical clean flowchart in Thuyết minh
</commit_message>
<xml_diff>
--- a/T1S_KMML_Thuyet_minh_Innovator.docx
+++ b/T1S_KMML_Thuyet_minh_Innovator.docx
@@ -111,7 +111,7 @@
       <w:r>
         <w:drawing>
           <wp:inline xmlns:a="http://schemas.openxmlformats.org/drawingml/2006/main" xmlns:pic="http://schemas.openxmlformats.org/drawingml/2006/picture">
-            <wp:extent cx="5303520" cy="2651760"/>
+            <wp:extent cx="5303520" cy="4773168"/>
             <wp:docPr id="1" name="Picture 1"/>
             <wp:cNvGraphicFramePr>
               <a:graphicFrameLocks noChangeAspect="1"/>
@@ -132,7 +132,7 @@
                   <pic:spPr>
                     <a:xfrm>
                       <a:off x="0" y="0"/>
-                      <a:ext cx="5303520" cy="2651760"/>
+                      <a:ext cx="5303520" cy="4773168"/>
                     </a:xfrm>
                     <a:prstGeom prst="rect"/>
                   </pic:spPr>

</xml_diff>